<commit_message>
Prepare v3.0.0 control panel release
</commit_message>
<xml_diff>
--- a/docs/reference/COMMANDS.docx
+++ b/docs/reference/COMMANDS.docx
@@ -14,12 +14,6 @@
           <w:szCs w:val="56"/>
         </w:rPr>
       </w:pPr>
-    </w:p>
-    <w:p>
-      <w:pPr>
-        <w:spacing w:before="1440" w:after="120"/>
-        <w:jc w:val="center"/>
-      </w:pPr>
       <w:r>
         <w:rPr>
           <w:b/>
@@ -28,6 +22,22 @@
           <w:sz w:val="56"/>
           <w:szCs w:val="56"/>
         </w:rPr>
+        <w:t>00</w:t>
+      </w:r>
+    </w:p>
+    <w:p>
+      <w:pPr>
+        <w:spacing w:before="1440" w:after="120"/>
+        <w:jc w:val="center"/>
+      </w:pPr>
+      <w:r>
+        <w:rPr>
+          <w:b/>
+          <w:bCs/>
+          <w:color w:val="1F3864"/>
+          <w:sz w:val="56"/>
+          <w:szCs w:val="56"/>
+        </w:rPr>
         <w:t>Synergy Devnet</w:t>
       </w:r>
     </w:p>
@@ -161,6 +171,9 @@
       </w:r>
       <w:r>
         <w:t>repo root</w:t>
+      </w:r>
+      <w:r>
+        <w:t>0</w:t>
       </w:r>
     </w:p>
     <w:p>

</xml_diff>